<commit_message>
Finalize verified competition submission package
</commit_message>
<xml_diff>
--- a/competition/submission/Nurlanuly_Dulat_EraSeMap_Annotatsiya_RU_EN.docx
+++ b/competition/submission/Nurlanuly_Dulat_EraSeMap_Annotatsiya_RU_EN.docx
@@ -120,13 +120,15 @@
     <w:p>
       <w:pPr>
         <w:pStyle w:val="Heading1"/>
+        <w:keepNext/>
       </w:pPr>
       <w:r>
-        <w:t>Аннотация (190 слов)</w:t>
+        <w:t>Аннотация (189 слов)</w:t>
       </w:r>
     </w:p>
     <w:p>
       <w:pPr>
+        <w:keepLines/>
         <w:widowControl/>
       </w:pPr>
       <w:r>
@@ -135,7 +137,7 @@
           <w:b w:val="0"/>
           <w:i w:val="0"/>
         </w:rPr>
-        <w:t>Команда удаления основной записи не гарантирует, что персональные данные перестали использоваться. Копии могут сохраняться в кэше, индексе, реплике, экспорте или резервной копии; производные — в биометрическом шаблоне и векторе; влияние — в обученной модели. Я разработал EraSeMap — один алгоритм из трёх стадий. FIND находит известные и ограниченно неочевидные пути. ERASE выбирает минимальный достаточный набор физических действий и удаление влияния из модели (machine unlearning). PROVE повторяет будущие операции и разрешает сертификат только после прохождения всех обязательных проверок. В заранее зафиксированной проверке переноса на 60 случаях EraSeMap дал 0 ложных COMPLETE против 5 у полного аудита узлов и 45 у обычного статуса сервиса. Активный поиск ограниченного графа восстановления потребовал 7 проб против 13 у случайной стратегии и 49 у полного перебора. В 20 парных опытах с реальными локальными процессами выбранный план был в 17,64 раза быстрее полной пересборки и записал на 94,62% меньше байтов. Временная проверка обнаружила 30 из 30 скрытых рисков и после контрольных действий дала 0 из 30 возвратов. Быстрые методы удаления влияния из Qwen2.5-1.5B не прошли все заранее заданные пороги, поэтому полное переобучение оставлено безопасным запасным вариантом. Результаты ограничены зарегистрированными топологиями и переходами; промышленное внедрение и независимая скрытая проверка не заявляются.</w:t>
+        <w:t>Удаление основной записи не гарантирует, что персональные данные перестали использоваться. Копии могут сохраняться в кэше, индексе, реплике, экспорте или резервной копии; производные — в биометрическом шаблоне и векторе; влияние — в обученной модели. Я разработал EraSeMap — один алгоритм из трёх стадий. FIND находит известные и ограниченно неочевидные пути. ERASE выбирает минимальный достаточный набор физических действий и удаление влияния из модели (machine unlearning). PROVE повторяет будущие операции и разрешает сертификат только после прохождения всех обязательных проверок. В заранее зафиксированной проверке переноса на 60 случаях EraSeMap дал 0 ложных COMPLETE против 5 у полного аудита узлов и 45 у обычного статуса сервиса. Активный поиск ограниченного графа восстановления потребовал 7 проб против 13 у случайной стратегии и 49 у полного перебора. В 20 парных опытах с реальными локальными процессами выбранный план был в 17,64 раза быстрее полной пересборки и записал на 94,62% меньше байтов. Временная проверка обнаружила 30 из 30 скрытых рисков и после контрольных действий дала 0 из 30 возвратов. Быстрые методы удаления влияния из Qwen2.5-1.5B не прошли все заранее заданные пороги, поэтому полное переобучение оставлено безопасным запасным вариантом. Результаты ограничены зарегистрированными топологиями и переходами; промышленное внедрение и независимая скрытая проверка не заявляются.</w:t>
       </w:r>
     </w:p>
     <w:p>
@@ -159,6 +161,7 @@
     <w:p>
       <w:pPr>
         <w:pStyle w:val="Heading1"/>
+        <w:keepNext/>
       </w:pPr>
       <w:r>
         <w:t>Abstract (203 words)</w:t>
@@ -166,6 +169,7 @@
     </w:p>
     <w:p>
       <w:pPr>
+        <w:keepLines/>
         <w:widowControl/>
       </w:pPr>
       <w:r>

</xml_diff>